<commit_message>
Remove old document templates and update existing templates for legal documents. Add .gitignore and requirements.txt for project dependencies.
</commit_message>
<xml_diff>
--- a/templates/at-plantilla-DocumentoJuridica.docx
+++ b/templates/at-plantilla-DocumentoJuridica.docx
@@ -1,6 +1,6 @@
 
 <file path=word/document.xml><?xml version="1.0" encoding="utf-8"?>
-<w:document xmlns:wpc="http://schemas.microsoft.com/office/word/2010/wordprocessingCanvas" xmlns:cx="http://schemas.microsoft.com/office/drawing/2014/chartex" xmlns:cx1="http://schemas.microsoft.com/office/drawing/2015/9/8/chartex" xmlns:cx2="http://schemas.microsoft.com/office/drawing/2015/10/21/chartex" xmlns:cx3="http://schemas.microsoft.com/office/drawing/2016/5/9/chartex" xmlns:cx4="http://schemas.microsoft.com/office/drawing/2016/5/10/chartex" xmlns:cx5="http://schemas.microsoft.com/office/drawing/2016/5/11/chartex" xmlns:cx6="http://schemas.microsoft.com/office/drawing/2016/5/12/chartex" xmlns:cx7="http://schemas.microsoft.com/office/drawing/2016/5/13/chartex" xmlns:cx8="http://schemas.microsoft.com/office/drawing/2016/5/14/chartex" xmlns:mc="http://schemas.openxmlformats.org/markup-compatibility/2006" xmlns:aink="http://schemas.microsoft.com/office/drawing/2016/ink" xmlns:am3d="http://schemas.microsoft.com/office/drawing/2017/model3d" xmlns:o="urn:schemas-microsoft-com:office:office" xmlns:oel="http://schemas.microsoft.com/office/2019/extlst" xmlns:r="http://schemas.openxmlformats.org/officeDocument/2006/relationships" xmlns:m="http://schemas.openxmlformats.org/officeDocument/2006/math" xmlns:v="urn:schemas-microsoft-com:vml" xmlns:wp14="http://schemas.microsoft.com/office/word/2010/wordprocessingDrawing" xmlns:wp="http://schemas.openxmlformats.org/drawingml/2006/wordprocessingDrawing" xmlns:w10="urn:schemas-microsoft-com:office:word" xmlns:w="http://schemas.openxmlformats.org/wordprocessingml/2006/main" xmlns:w14="http://schemas.microsoft.com/office/word/2010/wordml" xmlns:w15="http://schemas.microsoft.com/office/word/2012/wordml" xmlns:w16cex="http://schemas.microsoft.com/office/word/2018/wordml/cex" xmlns:w16cid="http://schemas.microsoft.com/office/word/2016/wordml/cid" xmlns:w16="http://schemas.microsoft.com/office/word/2018/wordml" xmlns:w16du="http://schemas.microsoft.com/office/word/2023/wordml/word16du" xmlns:w16sdtdh="http://schemas.microsoft.com/office/word/2020/wordml/sdtdatahash" xmlns:w16se="http://schemas.microsoft.com/office/word/2015/wordml/symex" xmlns:wpg="http://schemas.microsoft.com/office/word/2010/wordprocessingGroup" xmlns:wpi="http://schemas.microsoft.com/office/word/2010/wordprocessingInk" xmlns:wne="http://schemas.microsoft.com/office/word/2006/wordml" xmlns:wps="http://schemas.microsoft.com/office/word/2010/wordprocessingShape" mc:Ignorable="w14 w15 w16se w16cid w16 w16cex w16sdtdh w16du wp14">
+<w:document xmlns:wpc="http://schemas.microsoft.com/office/word/2010/wordprocessingCanvas" xmlns:cx="http://schemas.microsoft.com/office/drawing/2014/chartex" xmlns:cx1="http://schemas.microsoft.com/office/drawing/2015/9/8/chartex" xmlns:cx2="http://schemas.microsoft.com/office/drawing/2015/10/21/chartex" xmlns:cx3="http://schemas.microsoft.com/office/drawing/2016/5/9/chartex" xmlns:cx4="http://schemas.microsoft.com/office/drawing/2016/5/10/chartex" xmlns:cx5="http://schemas.microsoft.com/office/drawing/2016/5/11/chartex" xmlns:cx6="http://schemas.microsoft.com/office/drawing/2016/5/12/chartex" xmlns:cx7="http://schemas.microsoft.com/office/drawing/2016/5/13/chartex" xmlns:cx8="http://schemas.microsoft.com/office/drawing/2016/5/14/chartex" xmlns:mc="http://schemas.openxmlformats.org/markup-compatibility/2006" xmlns:aink="http://schemas.microsoft.com/office/drawing/2016/ink" xmlns:am3d="http://schemas.microsoft.com/office/drawing/2017/model3d" xmlns:o="urn:schemas-microsoft-com:office:office" xmlns:oel="http://schemas.microsoft.com/office/2019/extlst" xmlns:r="http://schemas.openxmlformats.org/officeDocument/2006/relationships" xmlns:m="http://schemas.openxmlformats.org/officeDocument/2006/math" xmlns:v="urn:schemas-microsoft-com:vml" xmlns:wp14="http://schemas.microsoft.com/office/word/2010/wordprocessingDrawing" xmlns:wp="http://schemas.openxmlformats.org/drawingml/2006/wordprocessingDrawing" xmlns:w10="urn:schemas-microsoft-com:office:word" xmlns:w="http://schemas.openxmlformats.org/wordprocessingml/2006/main" xmlns:w14="http://schemas.microsoft.com/office/word/2010/wordml" xmlns:w15="http://schemas.microsoft.com/office/word/2012/wordml" xmlns:w16cex="http://schemas.microsoft.com/office/word/2018/wordml/cex" xmlns:w16cid="http://schemas.microsoft.com/office/word/2016/wordml/cid" xmlns:w16="http://schemas.microsoft.com/office/word/2018/wordml" xmlns:w16du="http://schemas.microsoft.com/office/word/2023/wordml/word16du" xmlns:w16sdtdh="http://schemas.microsoft.com/office/word/2020/wordml/sdtdatahash" xmlns:w16sdtfl="http://schemas.microsoft.com/office/word/2024/wordml/sdtformatlock" xmlns:w16se="http://schemas.microsoft.com/office/word/2015/wordml/symex" xmlns:wpg="http://schemas.microsoft.com/office/word/2010/wordprocessingGroup" xmlns:wpi="http://schemas.microsoft.com/office/word/2010/wordprocessingInk" xmlns:wne="http://schemas.microsoft.com/office/word/2006/wordml" xmlns:wps="http://schemas.microsoft.com/office/word/2010/wordprocessingShape" mc:Ignorable="w14 w15 w16se w16cid w16 w16cex w16sdtdh w16sdtfl w16du wp14">
   <w:body>
     <w:p>
       <w:pPr>
@@ -4549,6 +4549,21 @@
           <w:lang w:val="es-ES" w:eastAsia="es-ES"/>
         </w:rPr>
       </w:pPr>
+    </w:p>
+    <w:p>
+      <w:pPr>
+        <w:tabs>
+          <w:tab w:val="left" w:pos="6945"/>
+        </w:tabs>
+        <w:spacing w:after="0" w:line="360" w:lineRule="auto"/>
+        <w:jc w:val="both"/>
+        <w:rPr>
+          <w:rFonts w:ascii="Times New Roman" w:eastAsiaTheme="minorEastAsia" w:hAnsi="Times New Roman" w:cs="Times New Roman"/>
+          <w:sz w:val="20"/>
+          <w:szCs w:val="20"/>
+          <w:lang w:val="es-ES" w:eastAsia="es-ES"/>
+        </w:rPr>
+      </w:pPr>
       <w:r>
         <w:rPr>
           <w:rFonts w:ascii="Times New Roman" w:eastAsiaTheme="minorEastAsia" w:hAnsi="Times New Roman" w:cs="Times New Roman"/>
@@ -4564,114 +4579,22 @@
         <w:spacing w:after="0" w:line="276" w:lineRule="auto"/>
         <w:jc w:val="both"/>
         <w:rPr>
-          <w:rFonts w:ascii="Times New Roman" w:eastAsiaTheme="minorEastAsia" w:hAnsi="Times New Roman" w:cs="Times New Roman"/>
-          <w:b/>
-          <w:sz w:val="20"/>
-          <w:szCs w:val="20"/>
-          <w:lang w:val="es-ES" w:eastAsia="es-ES"/>
-        </w:rPr>
+          <w:rFonts w:ascii="Times New Roman" w:hAnsi="Times New Roman" w:cs="Times New Roman"/>
+          <w:bCs/>
+          <w:sz w:val="20"/>
+          <w:szCs w:val="20"/>
+        </w:rPr>
+        <w:sectPr>
+          <w:headerReference w:type="default" r:id="rId8"/>
+          <w:footerReference w:type="default" r:id="rId9"/>
+          <w:type w:val="continuous"/>
+          <w:pgSz w:w="11906" w:h="16838" w:code="9"/>
+          <w:pgMar w:top="1077" w:right="849" w:bottom="426" w:left="993" w:header="567" w:footer="23" w:gutter="0"/>
+          <w:pgNumType w:start="1"/>
+          <w:cols w:space="708"/>
+          <w:docGrid w:linePitch="360"/>
+        </w:sectPr>
       </w:pPr>
-      <w:r>
-        <w:rPr>
-          <w:rFonts w:ascii="Times New Roman" w:hAnsi="Times New Roman" w:cs="Times New Roman"/>
-          <w:bCs/>
-          <w:sz w:val="20"/>
-          <w:szCs w:val="20"/>
-        </w:rPr>
-        <w:t>{{</w:t>
-      </w:r>
-      <w:proofErr w:type="spellStart"/>
-      <w:r>
-        <w:rPr>
-          <w:rFonts w:ascii="Times New Roman" w:hAnsi="Times New Roman" w:cs="Times New Roman"/>
-          <w:bCs/>
-          <w:sz w:val="20"/>
-          <w:szCs w:val="20"/>
-        </w:rPr>
-        <w:t>nombre_juez</w:t>
-      </w:r>
-      <w:proofErr w:type="spellEnd"/>
-      <w:r>
-        <w:rPr>
-          <w:rFonts w:ascii="Times New Roman" w:hAnsi="Times New Roman" w:cs="Times New Roman"/>
-          <w:bCs/>
-          <w:sz w:val="20"/>
-          <w:szCs w:val="20"/>
-        </w:rPr>
-        <w:t>}}</w:t>
-      </w:r>
-      <w:r>
-        <w:rPr>
-          <w:rFonts w:ascii="Times New Roman" w:eastAsiaTheme="minorEastAsia" w:hAnsi="Times New Roman" w:cs="Times New Roman"/>
-          <w:sz w:val="20"/>
-          <w:szCs w:val="20"/>
-          <w:lang w:val="es-ES" w:eastAsia="es-ES"/>
-        </w:rPr>
-        <w:tab/>
-      </w:r>
-      <w:r>
-        <w:rPr>
-          <w:rFonts w:ascii="Times New Roman" w:eastAsiaTheme="minorEastAsia" w:hAnsi="Times New Roman" w:cs="Times New Roman"/>
-          <w:sz w:val="20"/>
-          <w:szCs w:val="20"/>
-          <w:lang w:val="es-ES" w:eastAsia="es-ES"/>
-        </w:rPr>
-        <w:tab/>
-        <w:t xml:space="preserve">            </w:t>
-      </w:r>
-      <w:proofErr w:type="gramStart"/>
-      <w:r>
-        <w:rPr>
-          <w:rFonts w:ascii="Times New Roman" w:eastAsiaTheme="minorEastAsia" w:hAnsi="Times New Roman" w:cs="Times New Roman"/>
-          <w:sz w:val="20"/>
-          <w:szCs w:val="20"/>
-          <w:lang w:val="es-ES" w:eastAsia="es-ES"/>
-        </w:rPr>
-        <w:tab/>
-        <w:t xml:space="preserve">  </w:t>
-      </w:r>
-      <w:r>
-        <w:rPr>
-          <w:rFonts w:ascii="Times New Roman" w:eastAsiaTheme="minorEastAsia" w:hAnsi="Times New Roman" w:cs="Times New Roman"/>
-          <w:sz w:val="20"/>
-          <w:szCs w:val="20"/>
-          <w:lang w:val="es-ES" w:eastAsia="es-ES"/>
-        </w:rPr>
-        <w:tab/>
-      </w:r>
-      <w:proofErr w:type="gramEnd"/>
-      <w:r>
-        <w:rPr>
-          <w:rFonts w:ascii="Times New Roman" w:eastAsiaTheme="minorEastAsia" w:hAnsi="Times New Roman" w:cs="Times New Roman"/>
-          <w:bCs/>
-          <w:sz w:val="20"/>
-          <w:szCs w:val="20"/>
-          <w:lang w:val="es-ES" w:eastAsia="es-ES"/>
-        </w:rPr>
-        <w:t>{{</w:t>
-      </w:r>
-      <w:proofErr w:type="spellStart"/>
-      <w:r>
-        <w:rPr>
-          <w:rFonts w:ascii="Times New Roman" w:eastAsiaTheme="minorEastAsia" w:hAnsi="Times New Roman" w:cs="Times New Roman"/>
-          <w:bCs/>
-          <w:sz w:val="20"/>
-          <w:szCs w:val="20"/>
-          <w:lang w:val="es-ES" w:eastAsia="es-ES"/>
-        </w:rPr>
-        <w:t>nombre_abogado</w:t>
-      </w:r>
-      <w:proofErr w:type="spellEnd"/>
-      <w:r>
-        <w:rPr>
-          <w:rFonts w:ascii="Times New Roman" w:eastAsiaTheme="minorEastAsia" w:hAnsi="Times New Roman" w:cs="Times New Roman"/>
-          <w:bCs/>
-          <w:sz w:val="20"/>
-          <w:szCs w:val="20"/>
-          <w:lang w:val="es-ES" w:eastAsia="es-ES"/>
-        </w:rPr>
-        <w:t>}}</w:t>
-      </w:r>
     </w:p>
     <w:p>
       <w:pPr>
@@ -4687,15 +4610,124 @@
       </w:pPr>
       <w:r>
         <w:rPr>
+          <w:rFonts w:ascii="Times New Roman" w:hAnsi="Times New Roman" w:cs="Times New Roman"/>
+          <w:bCs/>
+          <w:sz w:val="20"/>
+          <w:szCs w:val="20"/>
+        </w:rPr>
+        <w:t>{{</w:t>
+      </w:r>
+      <w:proofErr w:type="spellStart"/>
+      <w:r>
+        <w:rPr>
+          <w:rFonts w:ascii="Times New Roman" w:hAnsi="Times New Roman" w:cs="Times New Roman"/>
+          <w:bCs/>
+          <w:sz w:val="20"/>
+          <w:szCs w:val="20"/>
+        </w:rPr>
+        <w:t>nombre_juez</w:t>
+      </w:r>
+      <w:proofErr w:type="spellEnd"/>
+      <w:r>
+        <w:rPr>
+          <w:rFonts w:ascii="Times New Roman" w:hAnsi="Times New Roman" w:cs="Times New Roman"/>
+          <w:bCs/>
+          <w:sz w:val="20"/>
+          <w:szCs w:val="20"/>
+        </w:rPr>
+        <w:t>}}</w:t>
+      </w:r>
+    </w:p>
+    <w:p>
+      <w:pPr>
+        <w:spacing w:after="0" w:line="276" w:lineRule="auto"/>
+        <w:jc w:val="both"/>
+        <w:rPr>
           <w:rFonts w:ascii="Times New Roman" w:eastAsiaTheme="minorEastAsia" w:hAnsi="Times New Roman" w:cs="Times New Roman"/>
           <w:b/>
           <w:sz w:val="20"/>
           <w:szCs w:val="20"/>
           <w:lang w:val="es-ES" w:eastAsia="es-ES"/>
         </w:rPr>
+        <w:sectPr>
+          <w:type w:val="continuous"/>
+          <w:pgSz w:w="11906" w:h="16838" w:code="9"/>
+          <w:pgMar w:top="1077" w:right="849" w:bottom="426" w:left="993" w:header="567" w:footer="23" w:gutter="0"/>
+          <w:pgNumType w:start="1"/>
+          <w:cols w:num="2" w:space="708"/>
+          <w:docGrid w:linePitch="360"/>
+        </w:sectPr>
+      </w:pPr>
+      <w:r>
+        <w:rPr>
+          <w:rFonts w:ascii="Times New Roman" w:eastAsiaTheme="minorEastAsia" w:hAnsi="Times New Roman" w:cs="Times New Roman"/>
+          <w:bCs/>
+          <w:sz w:val="20"/>
+          <w:szCs w:val="20"/>
+          <w:lang w:val="es-ES" w:eastAsia="es-ES"/>
+        </w:rPr>
+        <w:t xml:space="preserve">                    </w:t>
+      </w:r>
+      <w:r>
+        <w:rPr>
+          <w:rFonts w:ascii="Times New Roman" w:eastAsiaTheme="minorEastAsia" w:hAnsi="Times New Roman" w:cs="Times New Roman"/>
+          <w:bCs/>
+          <w:sz w:val="20"/>
+          <w:szCs w:val="20"/>
+          <w:lang w:val="es-ES" w:eastAsia="es-ES"/>
+        </w:rPr>
+        <w:t>{{</w:t>
+      </w:r>
+      <w:proofErr w:type="spellStart"/>
+      <w:r>
+        <w:rPr>
+          <w:rFonts w:ascii="Times New Roman" w:eastAsiaTheme="minorEastAsia" w:hAnsi="Times New Roman" w:cs="Times New Roman"/>
+          <w:bCs/>
+          <w:sz w:val="20"/>
+          <w:szCs w:val="20"/>
+          <w:lang w:val="es-ES" w:eastAsia="es-ES"/>
+        </w:rPr>
+        <w:t>nombre_abogado</w:t>
+      </w:r>
+      <w:proofErr w:type="spellEnd"/>
+      <w:r>
+        <w:rPr>
+          <w:rFonts w:ascii="Times New Roman" w:eastAsiaTheme="minorEastAsia" w:hAnsi="Times New Roman" w:cs="Times New Roman"/>
+          <w:bCs/>
+          <w:sz w:val="20"/>
+          <w:szCs w:val="20"/>
+          <w:lang w:val="es-ES" w:eastAsia="es-ES"/>
+        </w:rPr>
+        <w:t>}}</w:t>
+      </w:r>
+    </w:p>
+    <w:p>
+      <w:pPr>
+        <w:spacing w:after="0" w:line="276" w:lineRule="auto"/>
+        <w:jc w:val="both"/>
+        <w:rPr>
+          <w:rFonts w:ascii="Times New Roman" w:eastAsiaTheme="minorEastAsia" w:hAnsi="Times New Roman" w:cs="Times New Roman"/>
+          <w:b/>
+          <w:sz w:val="20"/>
+          <w:szCs w:val="20"/>
+          <w:lang w:val="es-ES" w:eastAsia="es-ES"/>
+        </w:rPr>
+      </w:pPr>
+      <w:r>
+        <w:rPr>
+          <w:rFonts w:ascii="Times New Roman" w:eastAsiaTheme="minorEastAsia" w:hAnsi="Times New Roman" w:cs="Times New Roman"/>
+          <w:b/>
+          <w:sz w:val="20"/>
+          <w:szCs w:val="20"/>
+          <w:lang w:val="es-ES" w:eastAsia="es-ES"/>
+        </w:rPr>
         <w:t>EJECUTOR DE COACTIVA DPP IESS</w:t>
       </w:r>
-      <w:r>
+    </w:p>
+    <w:p>
+      <w:pPr>
+        <w:spacing w:after="0" w:line="276" w:lineRule="auto"/>
+        <w:jc w:val="both"/>
         <w:rPr>
           <w:rFonts w:ascii="Times New Roman" w:eastAsiaTheme="minorEastAsia" w:hAnsi="Times New Roman" w:cs="Times New Roman"/>
           <w:b/>
@@ -4703,9 +4735,15 @@
           <w:szCs w:val="20"/>
           <w:lang w:val="es-ES" w:eastAsia="es-ES"/>
         </w:rPr>
-        <w:tab/>
-        <w:t xml:space="preserve">               </w:t>
-      </w:r>
+        <w:sectPr>
+          <w:type w:val="continuous"/>
+          <w:pgSz w:w="11906" w:h="16838" w:code="9"/>
+          <w:pgMar w:top="1077" w:right="849" w:bottom="426" w:left="993" w:header="567" w:footer="23" w:gutter="0"/>
+          <w:pgNumType w:start="1"/>
+          <w:cols w:num="2" w:space="708"/>
+          <w:docGrid w:linePitch="360"/>
+        </w:sectPr>
+      </w:pPr>
       <w:r>
         <w:rPr>
           <w:rFonts w:ascii="Times New Roman" w:eastAsiaTheme="minorEastAsia" w:hAnsi="Times New Roman" w:cs="Times New Roman"/>
@@ -4714,7 +4752,16 @@
           <w:szCs w:val="20"/>
           <w:lang w:val="es-ES" w:eastAsia="es-ES"/>
         </w:rPr>
-        <w:tab/>
+        <w:t xml:space="preserve">                    </w:t>
+      </w:r>
+      <w:r>
+        <w:rPr>
+          <w:rFonts w:ascii="Times New Roman" w:eastAsiaTheme="minorEastAsia" w:hAnsi="Times New Roman" w:cs="Times New Roman"/>
+          <w:b/>
+          <w:sz w:val="20"/>
+          <w:szCs w:val="20"/>
+          <w:lang w:val="es-ES" w:eastAsia="es-ES"/>
+        </w:rPr>
         <w:t>SECRETARIO-ABOGADO</w:t>
       </w:r>
     </w:p>
@@ -4990,8 +5037,6 @@
       </w:pPr>
     </w:p>
     <w:sectPr>
-      <w:headerReference w:type="default" r:id="rId8"/>
-      <w:footerReference w:type="default" r:id="rId9"/>
       <w:type w:val="continuous"/>
       <w:pgSz w:w="11906" w:h="16838" w:code="9"/>
       <w:pgMar w:top="1077" w:right="849" w:bottom="426" w:left="993" w:header="567" w:footer="23" w:gutter="0"/>
@@ -5004,7 +5049,7 @@
 </file>
 
 <file path=word/endnotes.xml><?xml version="1.0" encoding="utf-8"?>
-<w:endnotes xmlns:wpc="http://schemas.microsoft.com/office/word/2010/wordprocessingCanvas" xmlns:cx="http://schemas.microsoft.com/office/drawing/2014/chartex" xmlns:cx1="http://schemas.microsoft.com/office/drawing/2015/9/8/chartex" xmlns:cx2="http://schemas.microsoft.com/office/drawing/2015/10/21/chartex" xmlns:cx3="http://schemas.microsoft.com/office/drawing/2016/5/9/chartex" xmlns:cx4="http://schemas.microsoft.com/office/drawing/2016/5/10/chartex" xmlns:cx5="http://schemas.microsoft.com/office/drawing/2016/5/11/chartex" xmlns:cx6="http://schemas.microsoft.com/office/drawing/2016/5/12/chartex" xmlns:cx7="http://schemas.microsoft.com/office/drawing/2016/5/13/chartex" xmlns:cx8="http://schemas.microsoft.com/office/drawing/2016/5/14/chartex" xmlns:mc="http://schemas.openxmlformats.org/markup-compatibility/2006" xmlns:aink="http://schemas.microsoft.com/office/drawing/2016/ink" xmlns:am3d="http://schemas.microsoft.com/office/drawing/2017/model3d" xmlns:o="urn:schemas-microsoft-com:office:office" xmlns:oel="http://schemas.microsoft.com/office/2019/extlst" xmlns:r="http://schemas.openxmlformats.org/officeDocument/2006/relationships" xmlns:m="http://schemas.openxmlformats.org/officeDocument/2006/math" xmlns:v="urn:schemas-microsoft-com:vml" xmlns:wp14="http://schemas.microsoft.com/office/word/2010/wordprocessingDrawing" xmlns:wp="http://schemas.openxmlformats.org/drawingml/2006/wordprocessingDrawing" xmlns:w10="urn:schemas-microsoft-com:office:word" xmlns:w="http://schemas.openxmlformats.org/wordprocessingml/2006/main" xmlns:w14="http://schemas.microsoft.com/office/word/2010/wordml" xmlns:w15="http://schemas.microsoft.com/office/word/2012/wordml" xmlns:w16cex="http://schemas.microsoft.com/office/word/2018/wordml/cex" xmlns:w16cid="http://schemas.microsoft.com/office/word/2016/wordml/cid" xmlns:w16="http://schemas.microsoft.com/office/word/2018/wordml" xmlns:w16du="http://schemas.microsoft.com/office/word/2023/wordml/word16du" xmlns:w16sdtdh="http://schemas.microsoft.com/office/word/2020/wordml/sdtdatahash" xmlns:w16se="http://schemas.microsoft.com/office/word/2015/wordml/symex" xmlns:wpg="http://schemas.microsoft.com/office/word/2010/wordprocessingGroup" xmlns:wpi="http://schemas.microsoft.com/office/word/2010/wordprocessingInk" xmlns:wne="http://schemas.microsoft.com/office/word/2006/wordml" xmlns:wps="http://schemas.microsoft.com/office/word/2010/wordprocessingShape" mc:Ignorable="w14 w15 w16se w16cid w16 w16cex w16sdtdh w16du wp14">
+<w:endnotes xmlns:wpc="http://schemas.microsoft.com/office/word/2010/wordprocessingCanvas" xmlns:cx="http://schemas.microsoft.com/office/drawing/2014/chartex" xmlns:cx1="http://schemas.microsoft.com/office/drawing/2015/9/8/chartex" xmlns:cx2="http://schemas.microsoft.com/office/drawing/2015/10/21/chartex" xmlns:cx3="http://schemas.microsoft.com/office/drawing/2016/5/9/chartex" xmlns:cx4="http://schemas.microsoft.com/office/drawing/2016/5/10/chartex" xmlns:cx5="http://schemas.microsoft.com/office/drawing/2016/5/11/chartex" xmlns:cx6="http://schemas.microsoft.com/office/drawing/2016/5/12/chartex" xmlns:cx7="http://schemas.microsoft.com/office/drawing/2016/5/13/chartex" xmlns:cx8="http://schemas.microsoft.com/office/drawing/2016/5/14/chartex" xmlns:mc="http://schemas.openxmlformats.org/markup-compatibility/2006" xmlns:aink="http://schemas.microsoft.com/office/drawing/2016/ink" xmlns:am3d="http://schemas.microsoft.com/office/drawing/2017/model3d" xmlns:o="urn:schemas-microsoft-com:office:office" xmlns:oel="http://schemas.microsoft.com/office/2019/extlst" xmlns:r="http://schemas.openxmlformats.org/officeDocument/2006/relationships" xmlns:m="http://schemas.openxmlformats.org/officeDocument/2006/math" xmlns:v="urn:schemas-microsoft-com:vml" xmlns:wp14="http://schemas.microsoft.com/office/word/2010/wordprocessingDrawing" xmlns:wp="http://schemas.openxmlformats.org/drawingml/2006/wordprocessingDrawing" xmlns:w10="urn:schemas-microsoft-com:office:word" xmlns:w="http://schemas.openxmlformats.org/wordprocessingml/2006/main" xmlns:w14="http://schemas.microsoft.com/office/word/2010/wordml" xmlns:w15="http://schemas.microsoft.com/office/word/2012/wordml" xmlns:w16cex="http://schemas.microsoft.com/office/word/2018/wordml/cex" xmlns:w16cid="http://schemas.microsoft.com/office/word/2016/wordml/cid" xmlns:w16="http://schemas.microsoft.com/office/word/2018/wordml" xmlns:w16du="http://schemas.microsoft.com/office/word/2023/wordml/word16du" xmlns:w16sdtdh="http://schemas.microsoft.com/office/word/2020/wordml/sdtdatahash" xmlns:w16sdtfl="http://schemas.microsoft.com/office/word/2024/wordml/sdtformatlock" xmlns:w16se="http://schemas.microsoft.com/office/word/2015/wordml/symex" xmlns:wpg="http://schemas.microsoft.com/office/word/2010/wordprocessingGroup" xmlns:wpi="http://schemas.microsoft.com/office/word/2010/wordprocessingInk" xmlns:wne="http://schemas.microsoft.com/office/word/2006/wordml" xmlns:wps="http://schemas.microsoft.com/office/word/2010/wordprocessingShape" mc:Ignorable="w14 w15 w16se w16cid w16 w16cex w16sdtdh w16sdtfl w16du wp14">
   <w:endnote w:type="separator" w:id="-1">
     <w:p>
       <w:pPr>
@@ -5029,7 +5074,7 @@
 </file>
 
 <file path=word/footer1.xml><?xml version="1.0" encoding="utf-8"?>
-<w:ftr xmlns:wpc="http://schemas.microsoft.com/office/word/2010/wordprocessingCanvas" xmlns:cx="http://schemas.microsoft.com/office/drawing/2014/chartex" xmlns:cx1="http://schemas.microsoft.com/office/drawing/2015/9/8/chartex" xmlns:cx2="http://schemas.microsoft.com/office/drawing/2015/10/21/chartex" xmlns:cx3="http://schemas.microsoft.com/office/drawing/2016/5/9/chartex" xmlns:cx4="http://schemas.microsoft.com/office/drawing/2016/5/10/chartex" xmlns:cx5="http://schemas.microsoft.com/office/drawing/2016/5/11/chartex" xmlns:cx6="http://schemas.microsoft.com/office/drawing/2016/5/12/chartex" xmlns:cx7="http://schemas.microsoft.com/office/drawing/2016/5/13/chartex" xmlns:cx8="http://schemas.microsoft.com/office/drawing/2016/5/14/chartex" xmlns:mc="http://schemas.openxmlformats.org/markup-compatibility/2006" xmlns:aink="http://schemas.microsoft.com/office/drawing/2016/ink" xmlns:am3d="http://schemas.microsoft.com/office/drawing/2017/model3d" xmlns:o="urn:schemas-microsoft-com:office:office" xmlns:oel="http://schemas.microsoft.com/office/2019/extlst" xmlns:r="http://schemas.openxmlformats.org/officeDocument/2006/relationships" xmlns:m="http://schemas.openxmlformats.org/officeDocument/2006/math" xmlns:v="urn:schemas-microsoft-com:vml" xmlns:wp14="http://schemas.microsoft.com/office/word/2010/wordprocessingDrawing" xmlns:wp="http://schemas.openxmlformats.org/drawingml/2006/wordprocessingDrawing" xmlns:w10="urn:schemas-microsoft-com:office:word" xmlns:w="http://schemas.openxmlformats.org/wordprocessingml/2006/main" xmlns:w14="http://schemas.microsoft.com/office/word/2010/wordml" xmlns:w15="http://schemas.microsoft.com/office/word/2012/wordml" xmlns:w16cex="http://schemas.microsoft.com/office/word/2018/wordml/cex" xmlns:w16cid="http://schemas.microsoft.com/office/word/2016/wordml/cid" xmlns:w16="http://schemas.microsoft.com/office/word/2018/wordml" xmlns:w16du="http://schemas.microsoft.com/office/word/2023/wordml/word16du" xmlns:w16sdtdh="http://schemas.microsoft.com/office/word/2020/wordml/sdtdatahash" xmlns:w16se="http://schemas.microsoft.com/office/word/2015/wordml/symex" xmlns:wpg="http://schemas.microsoft.com/office/word/2010/wordprocessingGroup" xmlns:wpi="http://schemas.microsoft.com/office/word/2010/wordprocessingInk" xmlns:wne="http://schemas.microsoft.com/office/word/2006/wordml" xmlns:wps="http://schemas.microsoft.com/office/word/2010/wordprocessingShape" mc:Ignorable="w14 w15 w16se w16cid w16 w16cex w16sdtdh w16du wp14">
+<w:ftr xmlns:wpc="http://schemas.microsoft.com/office/word/2010/wordprocessingCanvas" xmlns:cx="http://schemas.microsoft.com/office/drawing/2014/chartex" xmlns:cx1="http://schemas.microsoft.com/office/drawing/2015/9/8/chartex" xmlns:cx2="http://schemas.microsoft.com/office/drawing/2015/10/21/chartex" xmlns:cx3="http://schemas.microsoft.com/office/drawing/2016/5/9/chartex" xmlns:cx4="http://schemas.microsoft.com/office/drawing/2016/5/10/chartex" xmlns:cx5="http://schemas.microsoft.com/office/drawing/2016/5/11/chartex" xmlns:cx6="http://schemas.microsoft.com/office/drawing/2016/5/12/chartex" xmlns:cx7="http://schemas.microsoft.com/office/drawing/2016/5/13/chartex" xmlns:cx8="http://schemas.microsoft.com/office/drawing/2016/5/14/chartex" xmlns:mc="http://schemas.openxmlformats.org/markup-compatibility/2006" xmlns:aink="http://schemas.microsoft.com/office/drawing/2016/ink" xmlns:am3d="http://schemas.microsoft.com/office/drawing/2017/model3d" xmlns:o="urn:schemas-microsoft-com:office:office" xmlns:oel="http://schemas.microsoft.com/office/2019/extlst" xmlns:r="http://schemas.openxmlformats.org/officeDocument/2006/relationships" xmlns:m="http://schemas.openxmlformats.org/officeDocument/2006/math" xmlns:v="urn:schemas-microsoft-com:vml" xmlns:wp14="http://schemas.microsoft.com/office/word/2010/wordprocessingDrawing" xmlns:wp="http://schemas.openxmlformats.org/drawingml/2006/wordprocessingDrawing" xmlns:w10="urn:schemas-microsoft-com:office:word" xmlns:w="http://schemas.openxmlformats.org/wordprocessingml/2006/main" xmlns:w14="http://schemas.microsoft.com/office/word/2010/wordml" xmlns:w15="http://schemas.microsoft.com/office/word/2012/wordml" xmlns:w16cex="http://schemas.microsoft.com/office/word/2018/wordml/cex" xmlns:w16cid="http://schemas.microsoft.com/office/word/2016/wordml/cid" xmlns:w16="http://schemas.microsoft.com/office/word/2018/wordml" xmlns:w16du="http://schemas.microsoft.com/office/word/2023/wordml/word16du" xmlns:w16sdtdh="http://schemas.microsoft.com/office/word/2020/wordml/sdtdatahash" xmlns:w16sdtfl="http://schemas.microsoft.com/office/word/2024/wordml/sdtformatlock" xmlns:w16se="http://schemas.microsoft.com/office/word/2015/wordml/symex" xmlns:wpg="http://schemas.microsoft.com/office/word/2010/wordprocessingGroup" xmlns:wpi="http://schemas.microsoft.com/office/word/2010/wordprocessingInk" xmlns:wne="http://schemas.microsoft.com/office/word/2006/wordml" xmlns:wps="http://schemas.microsoft.com/office/word/2010/wordprocessingShape" mc:Ignorable="w14 w15 w16se w16cid w16 w16cex w16sdtdh w16sdtfl w16du wp14">
   <w:p>
     <w:pPr>
       <w:tabs>
@@ -5084,7 +5129,7 @@
 </file>
 
 <file path=word/footnotes.xml><?xml version="1.0" encoding="utf-8"?>
-<w:footnotes xmlns:wpc="http://schemas.microsoft.com/office/word/2010/wordprocessingCanvas" xmlns:cx="http://schemas.microsoft.com/office/drawing/2014/chartex" xmlns:cx1="http://schemas.microsoft.com/office/drawing/2015/9/8/chartex" xmlns:cx2="http://schemas.microsoft.com/office/drawing/2015/10/21/chartex" xmlns:cx3="http://schemas.microsoft.com/office/drawing/2016/5/9/chartex" xmlns:cx4="http://schemas.microsoft.com/office/drawing/2016/5/10/chartex" xmlns:cx5="http://schemas.microsoft.com/office/drawing/2016/5/11/chartex" xmlns:cx6="http://schemas.microsoft.com/office/drawing/2016/5/12/chartex" xmlns:cx7="http://schemas.microsoft.com/office/drawing/2016/5/13/chartex" xmlns:cx8="http://schemas.microsoft.com/office/drawing/2016/5/14/chartex" xmlns:mc="http://schemas.openxmlformats.org/markup-compatibility/2006" xmlns:aink="http://schemas.microsoft.com/office/drawing/2016/ink" xmlns:am3d="http://schemas.microsoft.com/office/drawing/2017/model3d" xmlns:o="urn:schemas-microsoft-com:office:office" xmlns:oel="http://schemas.microsoft.com/office/2019/extlst" xmlns:r="http://schemas.openxmlformats.org/officeDocument/2006/relationships" xmlns:m="http://schemas.openxmlformats.org/officeDocument/2006/math" xmlns:v="urn:schemas-microsoft-com:vml" xmlns:wp14="http://schemas.microsoft.com/office/word/2010/wordprocessingDrawing" xmlns:wp="http://schemas.openxmlformats.org/drawingml/2006/wordprocessingDrawing" xmlns:w10="urn:schemas-microsoft-com:office:word" xmlns:w="http://schemas.openxmlformats.org/wordprocessingml/2006/main" xmlns:w14="http://schemas.microsoft.com/office/word/2010/wordml" xmlns:w15="http://schemas.microsoft.com/office/word/2012/wordml" xmlns:w16cex="http://schemas.microsoft.com/office/word/2018/wordml/cex" xmlns:w16cid="http://schemas.microsoft.com/office/word/2016/wordml/cid" xmlns:w16="http://schemas.microsoft.com/office/word/2018/wordml" xmlns:w16du="http://schemas.microsoft.com/office/word/2023/wordml/word16du" xmlns:w16sdtdh="http://schemas.microsoft.com/office/word/2020/wordml/sdtdatahash" xmlns:w16se="http://schemas.microsoft.com/office/word/2015/wordml/symex" xmlns:wpg="http://schemas.microsoft.com/office/word/2010/wordprocessingGroup" xmlns:wpi="http://schemas.microsoft.com/office/word/2010/wordprocessingInk" xmlns:wne="http://schemas.microsoft.com/office/word/2006/wordml" xmlns:wps="http://schemas.microsoft.com/office/word/2010/wordprocessingShape" mc:Ignorable="w14 w15 w16se w16cid w16 w16cex w16sdtdh w16du wp14">
+<w:footnotes xmlns:wpc="http://schemas.microsoft.com/office/word/2010/wordprocessingCanvas" xmlns:cx="http://schemas.microsoft.com/office/drawing/2014/chartex" xmlns:cx1="http://schemas.microsoft.com/office/drawing/2015/9/8/chartex" xmlns:cx2="http://schemas.microsoft.com/office/drawing/2015/10/21/chartex" xmlns:cx3="http://schemas.microsoft.com/office/drawing/2016/5/9/chartex" xmlns:cx4="http://schemas.microsoft.com/office/drawing/2016/5/10/chartex" xmlns:cx5="http://schemas.microsoft.com/office/drawing/2016/5/11/chartex" xmlns:cx6="http://schemas.microsoft.com/office/drawing/2016/5/12/chartex" xmlns:cx7="http://schemas.microsoft.com/office/drawing/2016/5/13/chartex" xmlns:cx8="http://schemas.microsoft.com/office/drawing/2016/5/14/chartex" xmlns:mc="http://schemas.openxmlformats.org/markup-compatibility/2006" xmlns:aink="http://schemas.microsoft.com/office/drawing/2016/ink" xmlns:am3d="http://schemas.microsoft.com/office/drawing/2017/model3d" xmlns:o="urn:schemas-microsoft-com:office:office" xmlns:oel="http://schemas.microsoft.com/office/2019/extlst" xmlns:r="http://schemas.openxmlformats.org/officeDocument/2006/relationships" xmlns:m="http://schemas.openxmlformats.org/officeDocument/2006/math" xmlns:v="urn:schemas-microsoft-com:vml" xmlns:wp14="http://schemas.microsoft.com/office/word/2010/wordprocessingDrawing" xmlns:wp="http://schemas.openxmlformats.org/drawingml/2006/wordprocessingDrawing" xmlns:w10="urn:schemas-microsoft-com:office:word" xmlns:w="http://schemas.openxmlformats.org/wordprocessingml/2006/main" xmlns:w14="http://schemas.microsoft.com/office/word/2010/wordml" xmlns:w15="http://schemas.microsoft.com/office/word/2012/wordml" xmlns:w16cex="http://schemas.microsoft.com/office/word/2018/wordml/cex" xmlns:w16cid="http://schemas.microsoft.com/office/word/2016/wordml/cid" xmlns:w16="http://schemas.microsoft.com/office/word/2018/wordml" xmlns:w16du="http://schemas.microsoft.com/office/word/2023/wordml/word16du" xmlns:w16sdtdh="http://schemas.microsoft.com/office/word/2020/wordml/sdtdatahash" xmlns:w16sdtfl="http://schemas.microsoft.com/office/word/2024/wordml/sdtformatlock" xmlns:w16se="http://schemas.microsoft.com/office/word/2015/wordml/symex" xmlns:wpg="http://schemas.microsoft.com/office/word/2010/wordprocessingGroup" xmlns:wpi="http://schemas.microsoft.com/office/word/2010/wordprocessingInk" xmlns:wne="http://schemas.microsoft.com/office/word/2006/wordml" xmlns:wps="http://schemas.microsoft.com/office/word/2010/wordprocessingShape" mc:Ignorable="w14 w15 w16se w16cid w16 w16cex w16sdtdh w16sdtfl w16du wp14">
   <w:footnote w:type="separator" w:id="-1">
     <w:p>
       <w:pPr>
@@ -5109,7 +5154,7 @@
 </file>
 
 <file path=word/header1.xml><?xml version="1.0" encoding="utf-8"?>
-<w:hdr xmlns:wpc="http://schemas.microsoft.com/office/word/2010/wordprocessingCanvas" xmlns:cx="http://schemas.microsoft.com/office/drawing/2014/chartex" xmlns:cx1="http://schemas.microsoft.com/office/drawing/2015/9/8/chartex" xmlns:cx2="http://schemas.microsoft.com/office/drawing/2015/10/21/chartex" xmlns:cx3="http://schemas.microsoft.com/office/drawing/2016/5/9/chartex" xmlns:cx4="http://schemas.microsoft.com/office/drawing/2016/5/10/chartex" xmlns:cx5="http://schemas.microsoft.com/office/drawing/2016/5/11/chartex" xmlns:cx6="http://schemas.microsoft.com/office/drawing/2016/5/12/chartex" xmlns:cx7="http://schemas.microsoft.com/office/drawing/2016/5/13/chartex" xmlns:cx8="http://schemas.microsoft.com/office/drawing/2016/5/14/chartex" xmlns:mc="http://schemas.openxmlformats.org/markup-compatibility/2006" xmlns:aink="http://schemas.microsoft.com/office/drawing/2016/ink" xmlns:am3d="http://schemas.microsoft.com/office/drawing/2017/model3d" xmlns:o="urn:schemas-microsoft-com:office:office" xmlns:oel="http://schemas.microsoft.com/office/2019/extlst" xmlns:r="http://schemas.openxmlformats.org/officeDocument/2006/relationships" xmlns:m="http://schemas.openxmlformats.org/officeDocument/2006/math" xmlns:v="urn:schemas-microsoft-com:vml" xmlns:wp14="http://schemas.microsoft.com/office/word/2010/wordprocessingDrawing" xmlns:wp="http://schemas.openxmlformats.org/drawingml/2006/wordprocessingDrawing" xmlns:w10="urn:schemas-microsoft-com:office:word" xmlns:w="http://schemas.openxmlformats.org/wordprocessingml/2006/main" xmlns:w14="http://schemas.microsoft.com/office/word/2010/wordml" xmlns:w15="http://schemas.microsoft.com/office/word/2012/wordml" xmlns:w16cex="http://schemas.microsoft.com/office/word/2018/wordml/cex" xmlns:w16cid="http://schemas.microsoft.com/office/word/2016/wordml/cid" xmlns:w16="http://schemas.microsoft.com/office/word/2018/wordml" xmlns:w16du="http://schemas.microsoft.com/office/word/2023/wordml/word16du" xmlns:w16sdtdh="http://schemas.microsoft.com/office/word/2020/wordml/sdtdatahash" xmlns:w16se="http://schemas.microsoft.com/office/word/2015/wordml/symex" xmlns:wpg="http://schemas.microsoft.com/office/word/2010/wordprocessingGroup" xmlns:wpi="http://schemas.microsoft.com/office/word/2010/wordprocessingInk" xmlns:wne="http://schemas.microsoft.com/office/word/2006/wordml" xmlns:wps="http://schemas.microsoft.com/office/word/2010/wordprocessingShape" mc:Ignorable="w14 w15 w16se w16cid w16 w16cex w16sdtdh w16du wp14">
+<w:hdr xmlns:wpc="http://schemas.microsoft.com/office/word/2010/wordprocessingCanvas" xmlns:cx="http://schemas.microsoft.com/office/drawing/2014/chartex" xmlns:cx1="http://schemas.microsoft.com/office/drawing/2015/9/8/chartex" xmlns:cx2="http://schemas.microsoft.com/office/drawing/2015/10/21/chartex" xmlns:cx3="http://schemas.microsoft.com/office/drawing/2016/5/9/chartex" xmlns:cx4="http://schemas.microsoft.com/office/drawing/2016/5/10/chartex" xmlns:cx5="http://schemas.microsoft.com/office/drawing/2016/5/11/chartex" xmlns:cx6="http://schemas.microsoft.com/office/drawing/2016/5/12/chartex" xmlns:cx7="http://schemas.microsoft.com/office/drawing/2016/5/13/chartex" xmlns:cx8="http://schemas.microsoft.com/office/drawing/2016/5/14/chartex" xmlns:mc="http://schemas.openxmlformats.org/markup-compatibility/2006" xmlns:aink="http://schemas.microsoft.com/office/drawing/2016/ink" xmlns:am3d="http://schemas.microsoft.com/office/drawing/2017/model3d" xmlns:o="urn:schemas-microsoft-com:office:office" xmlns:oel="http://schemas.microsoft.com/office/2019/extlst" xmlns:r="http://schemas.openxmlformats.org/officeDocument/2006/relationships" xmlns:m="http://schemas.openxmlformats.org/officeDocument/2006/math" xmlns:v="urn:schemas-microsoft-com:vml" xmlns:wp14="http://schemas.microsoft.com/office/word/2010/wordprocessingDrawing" xmlns:wp="http://schemas.openxmlformats.org/drawingml/2006/wordprocessingDrawing" xmlns:w10="urn:schemas-microsoft-com:office:word" xmlns:w="http://schemas.openxmlformats.org/wordprocessingml/2006/main" xmlns:w14="http://schemas.microsoft.com/office/word/2010/wordml" xmlns:w15="http://schemas.microsoft.com/office/word/2012/wordml" xmlns:w16cex="http://schemas.microsoft.com/office/word/2018/wordml/cex" xmlns:w16cid="http://schemas.microsoft.com/office/word/2016/wordml/cid" xmlns:w16="http://schemas.microsoft.com/office/word/2018/wordml" xmlns:w16du="http://schemas.microsoft.com/office/word/2023/wordml/word16du" xmlns:w16sdtdh="http://schemas.microsoft.com/office/word/2020/wordml/sdtdatahash" xmlns:w16sdtfl="http://schemas.microsoft.com/office/word/2024/wordml/sdtformatlock" xmlns:w16se="http://schemas.microsoft.com/office/word/2015/wordml/symex" xmlns:wpg="http://schemas.microsoft.com/office/word/2010/wordprocessingGroup" xmlns:wpi="http://schemas.microsoft.com/office/word/2010/wordprocessingInk" xmlns:wne="http://schemas.microsoft.com/office/word/2006/wordml" xmlns:wps="http://schemas.microsoft.com/office/word/2010/wordprocessingShape" mc:Ignorable="w14 w15 w16se w16cid w16 w16cex w16sdtdh w16sdtfl w16du wp14">
   <w:p>
     <w:pPr>
       <w:tabs>
@@ -5212,7 +5257,7 @@
 </file>
 
 <file path=word/numbering.xml><?xml version="1.0" encoding="utf-8"?>
-<w:numbering xmlns:wpc="http://schemas.microsoft.com/office/word/2010/wordprocessingCanvas" xmlns:cx="http://schemas.microsoft.com/office/drawing/2014/chartex" xmlns:cx1="http://schemas.microsoft.com/office/drawing/2015/9/8/chartex" xmlns:cx2="http://schemas.microsoft.com/office/drawing/2015/10/21/chartex" xmlns:cx3="http://schemas.microsoft.com/office/drawing/2016/5/9/chartex" xmlns:cx4="http://schemas.microsoft.com/office/drawing/2016/5/10/chartex" xmlns:cx5="http://schemas.microsoft.com/office/drawing/2016/5/11/chartex" xmlns:cx6="http://schemas.microsoft.com/office/drawing/2016/5/12/chartex" xmlns:cx7="http://schemas.microsoft.com/office/drawing/2016/5/13/chartex" xmlns:cx8="http://schemas.microsoft.com/office/drawing/2016/5/14/chartex" xmlns:mc="http://schemas.openxmlformats.org/markup-compatibility/2006" xmlns:aink="http://schemas.microsoft.com/office/drawing/2016/ink" xmlns:am3d="http://schemas.microsoft.com/office/drawing/2017/model3d" xmlns:o="urn:schemas-microsoft-com:office:office" xmlns:oel="http://schemas.microsoft.com/office/2019/extlst" xmlns:r="http://schemas.openxmlformats.org/officeDocument/2006/relationships" xmlns:m="http://schemas.openxmlformats.org/officeDocument/2006/math" xmlns:v="urn:schemas-microsoft-com:vml" xmlns:wp14="http://schemas.microsoft.com/office/word/2010/wordprocessingDrawing" xmlns:wp="http://schemas.openxmlformats.org/drawingml/2006/wordprocessingDrawing" xmlns:w10="urn:schemas-microsoft-com:office:word" xmlns:w="http://schemas.openxmlformats.org/wordprocessingml/2006/main" xmlns:w14="http://schemas.microsoft.com/office/word/2010/wordml" xmlns:w15="http://schemas.microsoft.com/office/word/2012/wordml" xmlns:w16cex="http://schemas.microsoft.com/office/word/2018/wordml/cex" xmlns:w16cid="http://schemas.microsoft.com/office/word/2016/wordml/cid" xmlns:w16="http://schemas.microsoft.com/office/word/2018/wordml" xmlns:w16du="http://schemas.microsoft.com/office/word/2023/wordml/word16du" xmlns:w16sdtdh="http://schemas.microsoft.com/office/word/2020/wordml/sdtdatahash" xmlns:w16se="http://schemas.microsoft.com/office/word/2015/wordml/symex" xmlns:wpg="http://schemas.microsoft.com/office/word/2010/wordprocessingGroup" xmlns:wpi="http://schemas.microsoft.com/office/word/2010/wordprocessingInk" xmlns:wne="http://schemas.microsoft.com/office/word/2006/wordml" xmlns:wps="http://schemas.microsoft.com/office/word/2010/wordprocessingShape" mc:Ignorable="w14 w15 w16se w16cid w16 w16cex w16sdtdh w16du wp14">
+<w:numbering xmlns:wpc="http://schemas.microsoft.com/office/word/2010/wordprocessingCanvas" xmlns:cx="http://schemas.microsoft.com/office/drawing/2014/chartex" xmlns:cx1="http://schemas.microsoft.com/office/drawing/2015/9/8/chartex" xmlns:cx2="http://schemas.microsoft.com/office/drawing/2015/10/21/chartex" xmlns:cx3="http://schemas.microsoft.com/office/drawing/2016/5/9/chartex" xmlns:cx4="http://schemas.microsoft.com/office/drawing/2016/5/10/chartex" xmlns:cx5="http://schemas.microsoft.com/office/drawing/2016/5/11/chartex" xmlns:cx6="http://schemas.microsoft.com/office/drawing/2016/5/12/chartex" xmlns:cx7="http://schemas.microsoft.com/office/drawing/2016/5/13/chartex" xmlns:cx8="http://schemas.microsoft.com/office/drawing/2016/5/14/chartex" xmlns:mc="http://schemas.openxmlformats.org/markup-compatibility/2006" xmlns:aink="http://schemas.microsoft.com/office/drawing/2016/ink" xmlns:am3d="http://schemas.microsoft.com/office/drawing/2017/model3d" xmlns:o="urn:schemas-microsoft-com:office:office" xmlns:oel="http://schemas.microsoft.com/office/2019/extlst" xmlns:r="http://schemas.openxmlformats.org/officeDocument/2006/relationships" xmlns:m="http://schemas.openxmlformats.org/officeDocument/2006/math" xmlns:v="urn:schemas-microsoft-com:vml" xmlns:wp14="http://schemas.microsoft.com/office/word/2010/wordprocessingDrawing" xmlns:wp="http://schemas.openxmlformats.org/drawingml/2006/wordprocessingDrawing" xmlns:w10="urn:schemas-microsoft-com:office:word" xmlns:w="http://schemas.openxmlformats.org/wordprocessingml/2006/main" xmlns:w14="http://schemas.microsoft.com/office/word/2010/wordml" xmlns:w15="http://schemas.microsoft.com/office/word/2012/wordml" xmlns:w16cex="http://schemas.microsoft.com/office/word/2018/wordml/cex" xmlns:w16cid="http://schemas.microsoft.com/office/word/2016/wordml/cid" xmlns:w16="http://schemas.microsoft.com/office/word/2018/wordml" xmlns:w16du="http://schemas.microsoft.com/office/word/2023/wordml/word16du" xmlns:w16sdtdh="http://schemas.microsoft.com/office/word/2020/wordml/sdtdatahash" xmlns:w16sdtfl="http://schemas.microsoft.com/office/word/2024/wordml/sdtformatlock" xmlns:w16se="http://schemas.microsoft.com/office/word/2015/wordml/symex" xmlns:wpg="http://schemas.microsoft.com/office/word/2010/wordprocessingGroup" xmlns:wpi="http://schemas.microsoft.com/office/word/2010/wordprocessingInk" xmlns:wne="http://schemas.microsoft.com/office/word/2006/wordml" xmlns:wps="http://schemas.microsoft.com/office/word/2010/wordprocessingShape" mc:Ignorable="w14 w15 w16se w16cid w16 w16cex w16sdtdh w16sdtfl w16du wp14">
   <w:abstractNum w:abstractNumId="0" w15:restartNumberingAfterBreak="0">
     <w:nsid w:val="25794275"/>
     <w:multiLevelType w:val="hybridMultilevel"/>
@@ -5658,7 +5703,7 @@
 </file>
 
 <file path=word/styles.xml><?xml version="1.0" encoding="utf-8"?>
-<w:styles xmlns:mc="http://schemas.openxmlformats.org/markup-compatibility/2006" xmlns:r="http://schemas.openxmlformats.org/officeDocument/2006/relationships" xmlns:w="http://schemas.openxmlformats.org/wordprocessingml/2006/main" xmlns:w14="http://schemas.microsoft.com/office/word/2010/wordml" xmlns:w15="http://schemas.microsoft.com/office/word/2012/wordml" xmlns:w16cex="http://schemas.microsoft.com/office/word/2018/wordml/cex" xmlns:w16cid="http://schemas.microsoft.com/office/word/2016/wordml/cid" xmlns:w16="http://schemas.microsoft.com/office/word/2018/wordml" xmlns:w16du="http://schemas.microsoft.com/office/word/2023/wordml/word16du" xmlns:w16sdtdh="http://schemas.microsoft.com/office/word/2020/wordml/sdtdatahash" xmlns:w16se="http://schemas.microsoft.com/office/word/2015/wordml/symex" mc:Ignorable="w14 w15 w16se w16cid w16 w16cex w16sdtdh w16du">
+<w:styles xmlns:mc="http://schemas.openxmlformats.org/markup-compatibility/2006" xmlns:r="http://schemas.openxmlformats.org/officeDocument/2006/relationships" xmlns:w="http://schemas.openxmlformats.org/wordprocessingml/2006/main" xmlns:w14="http://schemas.microsoft.com/office/word/2010/wordml" xmlns:w15="http://schemas.microsoft.com/office/word/2012/wordml" xmlns:w16cex="http://schemas.microsoft.com/office/word/2018/wordml/cex" xmlns:w16cid="http://schemas.microsoft.com/office/word/2016/wordml/cid" xmlns:w16="http://schemas.microsoft.com/office/word/2018/wordml" xmlns:w16du="http://schemas.microsoft.com/office/word/2023/wordml/word16du" xmlns:w16sdtdh="http://schemas.microsoft.com/office/word/2020/wordml/sdtdatahash" xmlns:w16sdtfl="http://schemas.microsoft.com/office/word/2024/wordml/sdtformatlock" xmlns:w16se="http://schemas.microsoft.com/office/word/2015/wordml/symex" mc:Ignorable="w14 w15 w16se w16cid w16 w16cex w16sdtdh w16sdtfl w16du">
   <w:docDefaults>
     <w:rPrDefault>
       <w:rPr>

</xml_diff>